<commit_message>
docs: update data mining report with longitudinal analysis section
</commit_message>
<xml_diff>
--- a/DATA_MINING_REPORT.docx
+++ b/DATA_MINING_REPORT.docx
@@ -848,6 +848,25 @@
         <w:t>87% of tech jobs are in Douala (economic hub) and Yaoundé (government capital), indicating a geographically constrained tech job market that may limit talent distribution.</w:t>
         <w:br/>
         <w:br/>
+        <w:t>### 9.5 Longitudinal Analysis Capability</w:t>
+        <w:br/>
+        <w:br/>
+        <w:t>The project now includes a **GitHub Actions workflow** (`.github/workflows/weekly_scraper.yml`) that runs every Monday at 03:00 UTC to automatically:</w:t>
+        <w:br/>
+        <w:t>- Scrape job listings from all active portals</w:t>
+        <w:br/>
+        <w:t>- Process and clean the data through the NLP pipeline</w:t>
+        <w:br/>
+        <w:t>- Update the SQLite database with new entries</w:t>
+        <w:br/>
+        <w:t>- Commit updated data back to the repository</w:t>
+        <w:br/>
+        <w:t>- Generate timestamped CSV exports for historical analysis</w:t>
+        <w:br/>
+        <w:br/>
+        <w:t>This automated system provides continuous data collection for longitudinal analysis, addressing the future work item mentioned in the original report about tracking real-time skill demand changes.</w:t>
+        <w:br/>
+        <w:br/>
         <w:t>---</w:t>
         <w:br/>
         <w:br/>
@@ -880,9 +899,9 @@
         <w:t>### 10.2 Future Work</w:t>
         <w:br/>
         <w:br/>
-        <w:t xml:space="preserve">1. **Longitudinal Analysis:**  </w:t>
-        <w:br/>
-        <w:t xml:space="preserve">   Implement weekly scraping to track real-time skill demand changes</w:t>
+        <w:t xml:space="preserve">1. **Enhanced Longitudinal Analysis:**  </w:t>
+        <w:br/>
+        <w:t xml:space="preserve">   Leverage the weekly GitHub Actions workflow to perform trend analysis on skill demand over time</w:t>
         <w:br/>
         <w:br/>
         <w:t xml:space="preserve">2. **Cluster Validation:**  </w:t>

</xml_diff>